<commit_message>
Update card stacking prototype and docs
</commit_message>
<xml_diff>
--- a/docs/card_stacking_game_documentation.docx
+++ b/docs/card_stacking_game_documentation.docx
@@ -2,30 +2,6 @@
 <file path=word/document.xml><?xml version="1.0" encoding="utf-8"?>
 <w:document xmlns:w="http://schemas.openxmlformats.org/wordprocessingml/2006/main" xmlns:m="http://schemas.openxmlformats.org/officeDocument/2006/math" xmlns:r="http://schemas.openxmlformats.org/officeDocument/2006/relationships" xmlns:o="urn:schemas-microsoft-com:office:office" xmlns:v="urn:schemas-microsoft-com:vml" xmlns:w10="urn:schemas-microsoft-com:office:word" xmlns:a="http://schemas.openxmlformats.org/drawingml/2006/main" xmlns:pic="http://schemas.openxmlformats.org/drawingml/2006/picture" xmlns:wp="http://schemas.openxmlformats.org/drawingml/2006/wordprocessingDrawing">
   <w:body>
-    <w:p>
-      <w:pPr>
-        <w:pStyle w:val="Title"/>
-      </w:pPr>
-      <w:r>
-        <w:t xml:space="preserve">Card Stacking Game: Current Implementation Notes</w:t>
-      </w:r>
-    </w:p>
-    <w:p>
-      <w:pPr>
-        <w:pStyle w:val="Author"/>
-      </w:pPr>
-      <w:r>
-        <w:t xml:space="preserve">Mismanaging Minutes</w:t>
-      </w:r>
-    </w:p>
-    <w:p>
-      <w:pPr>
-        <w:pStyle w:val="Date"/>
-      </w:pPr>
-      <w:r>
-        <w:t xml:space="preserve">July 2026</w:t>
-      </w:r>
-    </w:p>
     <w:bookmarkStart w:id="9" w:name="broad-overview"/>
     <w:p>
       <w:pPr>
@@ -55,7 +31,31 @@
         <w:t xml:space="preserve"> </w:t>
       </w:r>
       <w:r>
-        <w:t xml:space="preserve">oTree app is a timed card-choice task. Participants do not complete a fixed number of decision screens. Instead, after the introductory page, they keep seeing decision screens until the configured task duration expires, or until they are inactive for the configured inactivity limit.</w:t>
+        <w:t xml:space="preserve">oTree app is a timed card-choice task.</w:t>
+      </w:r>
+      <w:r>
+        <w:t xml:space="preserve"> </w:t>
+      </w:r>
+      <w:r>
+        <w:t xml:space="preserve">Participants do not complete a fixed number of decision screens.</w:t>
+      </w:r>
+      <w:r>
+        <w:t xml:space="preserve"> </w:t>
+      </w:r>
+      <w:r>
+        <w:t xml:space="preserve">Instead, after the introductory page, they keep seeing decision screens</w:t>
+      </w:r>
+      <w:r>
+        <w:t xml:space="preserve"> </w:t>
+      </w:r>
+      <w:r>
+        <w:t xml:space="preserve">until the configured task duration expires, or until they are inactive</w:t>
+      </w:r>
+      <w:r>
+        <w:t xml:space="preserve"> </w:t>
+      </w:r>
+      <w:r>
+        <w:t xml:space="preserve">for the configured inactivity limit.</w:t>
       </w:r>
     </w:p>
     <w:p>
@@ -63,7 +63,19 @@
         <w:pStyle w:val="BodyText"/>
       </w:pPr>
       <w:r>
-        <w:t xml:space="preserve">Each decision screen shows five cards in one row. One card is the main card. The other four cards are non-main cards, each with values X, Y, and Z. Non-main cards display</w:t>
+        <w:t xml:space="preserve">Each decision screen shows five cards in one row. One card is the main</w:t>
+      </w:r>
+      <w:r>
+        <w:t xml:space="preserve"> </w:t>
+      </w:r>
+      <w:r>
+        <w:t xml:space="preserve">card. The other four cards are non-main cards, each with values X, Y,</w:t>
+      </w:r>
+      <w:r>
+        <w:t xml:space="preserve"> </w:t>
+      </w:r>
+      <w:r>
+        <w:t xml:space="preserve">and Z. Non-main cards display</w:t>
       </w:r>
       <w:r>
         <w:t xml:space="preserve"> </w:t>
@@ -87,10 +99,16 @@
         <w:rPr>
           <w:rStyle w:val="VerbatimChar"/>
         </w:rPr>
-        <w:t xml:space="preserve">Y% of Zx multiplier</w:t>
-      </w:r>
-      <w:r>
-        <w:t xml:space="preserve">. Main cards do not display X, Y, or Z.</w:t>
+        <w:t xml:space="preserve">Y% of Zx</w:t>
+      </w:r>
+      <w:r>
+        <w:t xml:space="preserve">. Main cards do</w:t>
+      </w:r>
+      <w:r>
+        <w:t xml:space="preserve"> </w:t>
+      </w:r>
+      <w:r>
+        <w:t xml:space="preserve">not display X, Y, or Z.</w:t>
       </w:r>
     </w:p>
     <w:p>
@@ -98,7 +116,25 @@
         <w:pStyle w:val="BodyText"/>
       </w:pPr>
       <w:r>
-        <w:t xml:space="preserve">The implementation is still a development prototype. The first page is a development-only setup page for the experimenter. The final results page is also explicitly a development/debugging page and is not meant to be shown to participants in production.</w:t>
+        <w:t xml:space="preserve">The implementation is still a development prototype. The first page is a</w:t>
+      </w:r>
+      <w:r>
+        <w:t xml:space="preserve"> </w:t>
+      </w:r>
+      <w:r>
+        <w:t xml:space="preserve">development-only setup page for the experimenter. The final results page</w:t>
+      </w:r>
+      <w:r>
+        <w:t xml:space="preserve"> </w:t>
+      </w:r>
+      <w:r>
+        <w:t xml:space="preserve">is also explicitly a development/debugging page and is not meant to be</w:t>
+      </w:r>
+      <w:r>
+        <w:t xml:space="preserve"> </w:t>
+      </w:r>
+      <w:r>
+        <w:t xml:space="preserve">shown to participants in production.</w:t>
       </w:r>
     </w:p>
     <w:bookmarkEnd w:id="9"/>
@@ -144,7 +180,13 @@
         </w:numPr>
       </w:pPr>
       <w:r>
-        <w:t xml:space="preserve">For each participant, the app randomizes the color order and the main-card color.</w:t>
+        <w:t xml:space="preserve">For each participant, the app randomizes the color order and the</w:t>
+      </w:r>
+      <w:r>
+        <w:t xml:space="preserve"> </w:t>
+      </w:r>
+      <w:r>
+        <w:t xml:space="preserve">main-card color.</w:t>
       </w:r>
     </w:p>
     <w:p>
@@ -156,7 +198,19 @@
         </w:numPr>
       </w:pPr>
       <w:r>
-        <w:t xml:space="preserve">For each participant, the app creates a long pre-drawn sequence of screen types by sampling with replacement from the available screen types.</w:t>
+        <w:t xml:space="preserve">For each participant, the app creates a long pre-drawn sequence of</w:t>
+      </w:r>
+      <w:r>
+        <w:t xml:space="preserve"> </w:t>
+      </w:r>
+      <w:r>
+        <w:t xml:space="preserve">screen types by sampling with replacement from the available screen</w:t>
+      </w:r>
+      <w:r>
+        <w:t xml:space="preserve"> </w:t>
+      </w:r>
+      <w:r>
+        <w:t xml:space="preserve">types.</w:t>
       </w:r>
     </w:p>
     <w:p>
@@ -180,7 +234,13 @@
         </w:numPr>
       </w:pPr>
       <w:r>
-        <w:t xml:space="preserve">The participant sees the intro page and then starts the timed decision task.</w:t>
+        <w:t xml:space="preserve">The participant sees the intro page and then starts the timed</w:t>
+      </w:r>
+      <w:r>
+        <w:t xml:space="preserve"> </w:t>
+      </w:r>
+      <w:r>
+        <w:t xml:space="preserve">decision task.</w:t>
       </w:r>
     </w:p>
     <w:p>
@@ -192,7 +252,13 @@
         </w:numPr>
       </w:pPr>
       <w:r>
-        <w:t xml:space="preserve">The participant keeps seeing decision screens until the task duration expires or the inactivity limit is reached.</w:t>
+        <w:t xml:space="preserve">The participant keeps seeing decision screens until the task</w:t>
+      </w:r>
+      <w:r>
+        <w:t xml:space="preserve"> </w:t>
+      </w:r>
+      <w:r>
+        <w:t xml:space="preserve">duration expires or the inactivity limit is reached.</w:t>
       </w:r>
     </w:p>
     <w:p>
@@ -204,7 +270,13 @@
         </w:numPr>
       </w:pPr>
       <w:r>
-        <w:t xml:space="preserve">If the task duration expires, the participant goes to the development/debug results page.</w:t>
+        <w:t xml:space="preserve">If the task duration expires, the participant goes to the</w:t>
+      </w:r>
+      <w:r>
+        <w:t xml:space="preserve"> </w:t>
+      </w:r>
+      <w:r>
+        <w:t xml:space="preserve">development/debug results page.</w:t>
       </w:r>
     </w:p>
     <w:p>
@@ -216,7 +288,13 @@
         </w:numPr>
       </w:pPr>
       <w:r>
-        <w:t xml:space="preserve">If the participant is inactive for the inactivity limit, the participant goes to the inactivity-loss page.</w:t>
+        <w:t xml:space="preserve">If the participant is inactive for the inactivity limit, the</w:t>
+      </w:r>
+      <w:r>
+        <w:t xml:space="preserve"> </w:t>
+      </w:r>
+      <w:r>
+        <w:t xml:space="preserve">participant goes to the inactivity-loss page.</w:t>
       </w:r>
     </w:p>
     <w:bookmarkEnd w:id="10"/>
@@ -287,7 +365,19 @@
         <w:pStyle w:val="FirstParagraph"/>
       </w:pPr>
       <w:r>
-        <w:t xml:space="preserve">These are randomized at participant initialization during session creation. They are not chosen by the participant, and they are not set on the development setup page.</w:t>
+        <w:t xml:space="preserve">These are randomized at participant initialization during session</w:t>
+      </w:r>
+      <w:r>
+        <w:t xml:space="preserve"> </w:t>
+      </w:r>
+      <w:r>
+        <w:t xml:space="preserve">creation. They are not chosen by the participant, and they are not set</w:t>
+      </w:r>
+      <w:r>
+        <w:t xml:space="preserve"> </w:t>
+      </w:r>
+      <w:r>
+        <w:t xml:space="preserve">on the development setup page.</w:t>
       </w:r>
     </w:p>
     <w:bookmarkEnd w:id="11"/>
@@ -305,7 +395,25 @@
         <w:pStyle w:val="FirstParagraph"/>
       </w:pPr>
       <w:r>
-        <w:t xml:space="preserve">For a given participant, the color order is fixed across all decision screens. The main-card color is also fixed across all decision screens. This means the same color remains the main card throughout that participant’s task.</w:t>
+        <w:t xml:space="preserve">For a given participant, the color order is fixed across all decision</w:t>
+      </w:r>
+      <w:r>
+        <w:t xml:space="preserve"> </w:t>
+      </w:r>
+      <w:r>
+        <w:t xml:space="preserve">screens. The main-card color is also fixed across all decision screens.</w:t>
+      </w:r>
+      <w:r>
+        <w:t xml:space="preserve"> </w:t>
+      </w:r>
+      <w:r>
+        <w:t xml:space="preserve">This means the same color remains the main card throughout that</w:t>
+      </w:r>
+      <w:r>
+        <w:t xml:space="preserve"> </w:t>
+      </w:r>
+      <w:r>
+        <w:t xml:space="preserve">participant’s task.</w:t>
       </w:r>
     </w:p>
     <w:bookmarkEnd w:id="12"/>
@@ -323,7 +431,31 @@
         <w:pStyle w:val="FirstParagraph"/>
       </w:pPr>
       <w:r>
-        <w:t xml:space="preserve">The app pre-generates a long sequence of decision screen types for each participant. This sequence is generated by sampling with replacement from the available screen types. The current maximum sequence length is based on the maximum allowed duration of 40 minutes and an assumed fastest decision speed of 0.5 seconds per decision screen.</w:t>
+        <w:t xml:space="preserve">The app pre-generates a long sequence of decision screen types for each</w:t>
+      </w:r>
+      <w:r>
+        <w:t xml:space="preserve"> </w:t>
+      </w:r>
+      <w:r>
+        <w:t xml:space="preserve">participant. This sequence is generated by sampling with replacement</w:t>
+      </w:r>
+      <w:r>
+        <w:t xml:space="preserve"> </w:t>
+      </w:r>
+      <w:r>
+        <w:t xml:space="preserve">from the available screen types. The current maximum sequence length is</w:t>
+      </w:r>
+      <w:r>
+        <w:t xml:space="preserve"> </w:t>
+      </w:r>
+      <w:r>
+        <w:t xml:space="preserve">based on the maximum allowed duration of 40 minutes and an assumed</w:t>
+      </w:r>
+      <w:r>
+        <w:t xml:space="preserve"> </w:t>
+      </w:r>
+      <w:r>
+        <w:t xml:space="preserve">fastest decision speed of 0.5 seconds per decision screen.</w:t>
       </w:r>
     </w:p>
     <w:p>
@@ -375,7 +507,13 @@
         <w:pStyle w:val="FirstParagraph"/>
       </w:pPr>
       <w:r>
-        <w:t xml:space="preserve">Most participants will use only the beginning of this sequence, because the task ends when the configured task duration expires.</w:t>
+        <w:t xml:space="preserve">Most participants will use only the beginning of this sequence, because</w:t>
+      </w:r>
+      <w:r>
+        <w:t xml:space="preserve"> </w:t>
+      </w:r>
+      <w:r>
+        <w:t xml:space="preserve">the task ends when the configured task duration expires.</w:t>
       </w:r>
     </w:p>
     <w:bookmarkEnd w:id="13"/>
@@ -433,7 +571,19 @@
         <w:pStyle w:val="FirstParagraph"/>
       </w:pPr>
       <w:r>
-        <w:t xml:space="preserve">The file currently contains 50 screen types. Each screen type defines the X, Y, and Z values for the four non-main cards. The main card has no X, Y, or Z values.</w:t>
+        <w:t xml:space="preserve">The file currently contains 50 screen types. Each screen type defines</w:t>
+      </w:r>
+      <w:r>
+        <w:t xml:space="preserve"> </w:t>
+      </w:r>
+      <w:r>
+        <w:t xml:space="preserve">the X, Y, and Z values for the four non-main cards. The main card has no</w:t>
+      </w:r>
+      <w:r>
+        <w:t xml:space="preserve"> </w:t>
+      </w:r>
+      <w:r>
+        <w:t xml:space="preserve">X, Y, or Z values.</w:t>
       </w:r>
     </w:p>
     <w:p>
@@ -441,7 +591,19 @@
         <w:pStyle w:val="BodyText"/>
       </w:pPr>
       <w:r>
-        <w:t xml:space="preserve">The number of screen types is currently expected to be 50 by default. The file must contain consecutive ids from 1 to 50 unless the session configuration is changed parametrically in code.</w:t>
+        <w:t xml:space="preserve">The number of screen types is currently expected to be 50 by default.</w:t>
+      </w:r>
+      <w:r>
+        <w:t xml:space="preserve"> </w:t>
+      </w:r>
+      <w:r>
+        <w:t xml:space="preserve">The file must contain consecutive ids from 1 to 50 unless the session</w:t>
+      </w:r>
+      <w:r>
+        <w:t xml:space="preserve"> </w:t>
+      </w:r>
+      <w:r>
+        <w:t xml:space="preserve">configuration is changed parametrically in code.</w:t>
       </w:r>
     </w:p>
     <w:bookmarkEnd w:id="15"/>
@@ -507,6 +669,18 @@
         </w:numPr>
       </w:pPr>
       <w:r>
+        <w:t xml:space="preserve">Whether per-click point feedback is shown.</w:t>
+      </w:r>
+    </w:p>
+    <w:p>
+      <w:pPr>
+        <w:pStyle w:val="Compact"/>
+        <w:numPr>
+          <w:ilvl w:val="0"/>
+          <w:numId w:val="1004"/>
+        </w:numPr>
+      </w:pPr>
+      <w:r>
         <w:t xml:space="preserve">Common post-click feedback delay in milliseconds.</w:t>
       </w:r>
     </w:p>
@@ -519,6 +693,18 @@
         </w:numPr>
       </w:pPr>
       <w:r>
+        <w:t xml:space="preserve">L-th main-card feedback delay in milliseconds.</w:t>
+      </w:r>
+    </w:p>
+    <w:p>
+      <w:pPr>
+        <w:pStyle w:val="Compact"/>
+        <w:numPr>
+          <w:ilvl w:val="0"/>
+          <w:numId w:val="1004"/>
+        </w:numPr>
+      </w:pPr>
+      <w:r>
         <w:t xml:space="preserve">Main-card bonus threshold L.</w:t>
       </w:r>
     </w:p>
@@ -587,7 +773,7 @@
         </w:numPr>
       </w:pPr>
       <w:r>
-        <w:t xml:space="preserve">Common post-click feedback delay: 1,100 ms.</w:t>
+        <w:t xml:space="preserve">Show per-click point feedback: yes.</w:t>
       </w:r>
     </w:p>
     <w:p>
@@ -599,7 +785,7 @@
         </w:numPr>
       </w:pPr>
       <w:r>
-        <w:t xml:space="preserve">Main-card bonus threshold L: duration in minutes times 50, rounded.</w:t>
+        <w:t xml:space="preserve">Common post-click feedback delay: 600 ms.</w:t>
       </w:r>
     </w:p>
     <w:p>
@@ -611,7 +797,31 @@
         </w:numPr>
       </w:pPr>
       <w:r>
-        <w:t xml:space="preserve">Main-card bonus points Q: L x 15.</w:t>
+        <w:t xml:space="preserve">L-th main-card feedback delay: 1,000 ms.</w:t>
+      </w:r>
+    </w:p>
+    <w:p>
+      <w:pPr>
+        <w:pStyle w:val="Compact"/>
+        <w:numPr>
+          <w:ilvl w:val="0"/>
+          <w:numId w:val="1005"/>
+        </w:numPr>
+      </w:pPr>
+      <w:r>
+        <w:t xml:space="preserve">Main-card bonus threshold L: duration in minutes times 55, rounded.</w:t>
+      </w:r>
+    </w:p>
+    <w:p>
+      <w:pPr>
+        <w:pStyle w:val="Compact"/>
+        <w:numPr>
+          <w:ilvl w:val="0"/>
+          <w:numId w:val="1005"/>
+        </w:numPr>
+      </w:pPr>
+      <w:r>
+        <w:t xml:space="preserve">Main-card bonus points Q: L x 30.</w:t>
       </w:r>
     </w:p>
     <w:p>
@@ -619,7 +829,19 @@
         <w:pStyle w:val="FirstParagraph"/>
       </w:pPr>
       <w:r>
-        <w:t xml:space="preserve">The setup page dynamically updates the default L and Q fields: changing the duration updates L, and changing L updates Q. The experimenter can override those values before starting the participant task.</w:t>
+        <w:t xml:space="preserve">The setup page dynamically updates the default L and Q fields: changing</w:t>
+      </w:r>
+      <w:r>
+        <w:t xml:space="preserve"> </w:t>
+      </w:r>
+      <w:r>
+        <w:t xml:space="preserve">the duration updates L, and changing L updates Q. The experimenter can</w:t>
+      </w:r>
+      <w:r>
+        <w:t xml:space="preserve"> </w:t>
+      </w:r>
+      <w:r>
+        <w:t xml:space="preserve">override those values before starting the participant task.</w:t>
       </w:r>
     </w:p>
     <w:bookmarkEnd w:id="16"/>
@@ -673,7 +895,7 @@
         </w:numPr>
       </w:pPr>
       <w:r>
-        <w:t xml:space="preserve">Points accumulated.</w:t>
+        <w:t xml:space="preserve">Total Points.</w:t>
       </w:r>
     </w:p>
     <w:p>
@@ -697,7 +919,13 @@
         </w:numPr>
       </w:pPr>
       <w:r>
-        <w:t xml:space="preserve">A feedback cue after the participant clicks a card.</w:t>
+        <w:t xml:space="preserve">A per-click feedback cue after the participant clicks a card, if</w:t>
+      </w:r>
+      <w:r>
+        <w:t xml:space="preserve"> </w:t>
+      </w:r>
+      <w:r>
+        <w:t xml:space="preserve">enabled.</w:t>
       </w:r>
     </w:p>
     <w:p>
@@ -717,7 +945,19 @@
         <w:pStyle w:val="FirstParagraph"/>
       </w:pPr>
       <w:r>
-        <w:t xml:space="preserve">The time-left counter is a countdown, not elapsed time. The inactivity counter resets when the participant moves the mouse, presses a key, touches the screen, scrolls, or clicks.</w:t>
+        <w:t xml:space="preserve">The time-left counter is a countdown, not elapsed time. The inactivity</w:t>
+      </w:r>
+      <w:r>
+        <w:t xml:space="preserve"> </w:t>
+      </w:r>
+      <w:r>
+        <w:t xml:space="preserve">counter resets when the participant moves the mouse, presses a key,</w:t>
+      </w:r>
+      <w:r>
+        <w:t xml:space="preserve"> </w:t>
+      </w:r>
+      <w:r>
+        <w:t xml:space="preserve">touches the screen, scrolls, or clicks.</w:t>
       </w:r>
     </w:p>
     <w:bookmarkEnd w:id="17"/>
@@ -735,7 +975,19 @@
         <w:pStyle w:val="FirstParagraph"/>
       </w:pPr>
       <w:r>
-        <w:t xml:space="preserve">After a participant clicks a card, the selected card is visually marked and all cards are disabled. The participant remains on the same screen for the common post-click feedback delay. The default delay is 1,100 ms.</w:t>
+        <w:t xml:space="preserve">After a participant clicks a card, the selected card is visually marked</w:t>
+      </w:r>
+      <w:r>
+        <w:t xml:space="preserve"> </w:t>
+      </w:r>
+      <w:r>
+        <w:t xml:space="preserve">and all cards are disabled. The participant remains on the same screen</w:t>
+      </w:r>
+      <w:r>
+        <w:t xml:space="preserve"> </w:t>
+      </w:r>
+      <w:r>
+        <w:t xml:space="preserve">for a post-click feedback delay. The common default delay is 600 ms.</w:t>
       </w:r>
     </w:p>
     <w:p>
@@ -743,7 +995,39 @@
         <w:pStyle w:val="BodyText"/>
       </w:pPr>
       <w:r>
-        <w:t xml:space="preserve">The delay is intended to be the same regardless of whether the participant clicked a main card or a non-main card, and regardless of whether a multiplier or main-card bonus was triggered.</w:t>
+        <w:t xml:space="preserve">There is one exception: the click that triggers the L-th main-card bonus</w:t>
+      </w:r>
+      <w:r>
+        <w:t xml:space="preserve"> </w:t>
+      </w:r>
+      <w:r>
+        <w:t xml:space="preserve">uses the separate L-th main-card feedback delay, which defaults to 1,000</w:t>
+      </w:r>
+      <w:r>
+        <w:t xml:space="preserve"> </w:t>
+      </w:r>
+      <w:r>
+        <w:t xml:space="preserve">ms. This gives the L-th main-card bonus cue more time on screen.</w:t>
+      </w:r>
+    </w:p>
+    <w:p>
+      <w:pPr>
+        <w:pStyle w:val="BodyText"/>
+      </w:pPr>
+      <w:r>
+        <w:t xml:space="preserve">The experimenter can turn per-click point feedback on or off. This</w:t>
+      </w:r>
+      <w:r>
+        <w:t xml:space="preserve"> </w:t>
+      </w:r>
+      <w:r>
+        <w:t xml:space="preserve">changes only whether the feedback boxes are displayed. It does not</w:t>
+      </w:r>
+      <w:r>
+        <w:t xml:space="preserve"> </w:t>
+      </w:r>
+      <w:r>
+        <w:t xml:space="preserve">change the points calculation, saved data, or post-click delay.</w:t>
       </w:r>
     </w:p>
     <w:bookmarkStart w:id="18" w:name="main-card"/>
@@ -768,7 +1052,19 @@
         <w:pStyle w:val="BodyText"/>
       </w:pPr>
       <w:r>
-        <w:t xml:space="preserve">If the participant collects the L-th main card and the one-time main-card bonus has not already been triggered, the app adds Q points and shows:</w:t>
+        <w:t xml:space="preserve">If the participant collects the L-th main card and the one-time</w:t>
+      </w:r>
+      <w:r>
+        <w:t xml:space="preserve"> </w:t>
+      </w:r>
+      <w:r>
+        <w:t xml:space="preserve">main-card bonus has not already been triggered, the app adds Q points</w:t>
+      </w:r>
+      <w:r>
+        <w:t xml:space="preserve"> </w:t>
+      </w:r>
+      <w:r>
+        <w:t xml:space="preserve">and shows:</w:t>
       </w:r>
     </w:p>
     <w:p>
@@ -779,7 +1075,7 @@
         <w:rPr>
           <w:rStyle w:val="VerbatimChar"/>
         </w:rPr>
-        <w:t xml:space="preserve">+Q points -- collected Lth main cards</w:t>
+        <w:t xml:space="preserve">+Q points -- collected L main cards</w:t>
       </w:r>
     </w:p>
     <w:p>
@@ -787,7 +1083,13 @@
         <w:pStyle w:val="FirstParagraph"/>
       </w:pPr>
       <w:r>
-        <w:t xml:space="preserve">For example, if Q=30 and L=2, the cue is:</w:t>
+        <w:t xml:space="preserve">In the current interface, the threshold number is shown numerically. For</w:t>
+      </w:r>
+      <w:r>
+        <w:t xml:space="preserve"> </w:t>
+      </w:r>
+      <w:r>
+        <w:t xml:space="preserve">example, if Q=60 and L=2, the cue is:</w:t>
       </w:r>
     </w:p>
     <w:p>
@@ -798,7 +1100,7 @@
         <w:rPr>
           <w:rStyle w:val="VerbatimChar"/>
         </w:rPr>
-        <w:t xml:space="preserve">+30 points -- collected 2nd main cards</w:t>
+        <w:t xml:space="preserve">+60 points -- collected 2 main cards</w:t>
       </w:r>
     </w:p>
     <w:p>
@@ -806,7 +1108,19 @@
         <w:pStyle w:val="FirstParagraph"/>
       </w:pPr>
       <w:r>
-        <w:t xml:space="preserve">The main-card bonus can trigger only once per participant.</w:t>
+        <w:t xml:space="preserve">The main-card bonus can trigger only once per participant. This click</w:t>
+      </w:r>
+      <w:r>
+        <w:t xml:space="preserve"> </w:t>
+      </w:r>
+      <w:r>
+        <w:t xml:space="preserve">uses the L-th main-card feedback delay rather than the common post-click</w:t>
+      </w:r>
+      <w:r>
+        <w:t xml:space="preserve"> </w:t>
+      </w:r>
+      <w:r>
+        <w:t xml:space="preserve">delay.</w:t>
       </w:r>
     </w:p>
     <w:bookmarkEnd w:id="18"/>
@@ -824,7 +1138,13 @@
         <w:pStyle w:val="FirstParagraph"/>
       </w:pPr>
       <w:r>
-        <w:t xml:space="preserve">If the participant chooses a non-main card and the multiplier is not applied, the participant receives X points and sees:</w:t>
+        <w:t xml:space="preserve">If the participant chooses a non-main card and the multiplier is not</w:t>
+      </w:r>
+      <w:r>
+        <w:t xml:space="preserve"> </w:t>
+      </w:r>
+      <w:r>
+        <w:t xml:space="preserve">applied, the participant receives X points and sees:</w:t>
       </w:r>
     </w:p>
     <w:p>
@@ -853,7 +1173,37 @@
         <w:pStyle w:val="FirstParagraph"/>
       </w:pPr>
       <w:r>
-        <w:t xml:space="preserve">If the participant chooses a non-main card, the multiplier is applied with probability Y%. If it is applied, the participant receives X x Z points and sees:</w:t>
+        <w:t xml:space="preserve">If the participant chooses a non-main card, the multiplier is applied</w:t>
+      </w:r>
+      <w:r>
+        <w:t xml:space="preserve"> </w:t>
+      </w:r>
+      <w:r>
+        <w:t xml:space="preserve">with probability Y%. If it is applied, the participant receives X x Z</w:t>
+      </w:r>
+      <w:r>
+        <w:t xml:space="preserve"> </w:t>
+      </w:r>
+      <w:r>
+        <w:t xml:space="preserve">points. If per-click feedback is enabled, the participant sees two</w:t>
+      </w:r>
+      <w:r>
+        <w:t xml:space="preserve"> </w:t>
+      </w:r>
+      <w:r>
+        <w:t xml:space="preserve">adjacent boxes. The first box shows the actual points added after</w:t>
+      </w:r>
+      <w:r>
+        <w:t xml:space="preserve"> </w:t>
+      </w:r>
+      <w:r>
+        <w:t xml:space="preserve">applying the multiplier, and the second box only shows the multiplier</w:t>
+      </w:r>
+      <w:r>
+        <w:t xml:space="preserve"> </w:t>
+      </w:r>
+      <w:r>
+        <w:t xml:space="preserve">size:</w:t>
       </w:r>
     </w:p>
     <w:p>
@@ -864,7 +1214,7 @@
         <w:rPr>
           <w:rStyle w:val="VerbatimChar"/>
         </w:rPr>
-        <w:t xml:space="preserve">+X points -- Zx multiplier applied</w:t>
+        <w:t xml:space="preserve">+X points     Zx</w:t>
       </w:r>
     </w:p>
     <w:p>
@@ -872,7 +1222,7 @@
         <w:pStyle w:val="FirstParagraph"/>
       </w:pPr>
       <w:r>
-        <w:t xml:space="preserve">In that cue,</w:t>
+        <w:t xml:space="preserve">Here,</w:t>
       </w:r>
       <w:r>
         <w:t xml:space="preserve"> </w:t>
@@ -887,7 +1237,13 @@
         <w:t xml:space="preserve"> </w:t>
       </w:r>
       <w:r>
-        <w:t xml:space="preserve">is the actual number of points added after applying the multiplier.</w:t>
+        <w:t xml:space="preserve">is the actual number of points added after applying the</w:t>
+      </w:r>
+      <w:r>
+        <w:t xml:space="preserve"> </w:t>
+      </w:r>
+      <w:r>
+        <w:t xml:space="preserve">multiplier.</w:t>
       </w:r>
     </w:p>
     <w:bookmarkEnd w:id="20"/>
@@ -906,7 +1262,13 @@
         <w:pStyle w:val="FirstParagraph"/>
       </w:pPr>
       <w:r>
-        <w:t xml:space="preserve">The app saves setup choices, displayed card information, participant choices, timing, and point outcomes.</w:t>
+        <w:t xml:space="preserve">The app saves setup choices, displayed card information, participant</w:t>
+      </w:r>
+      <w:r>
+        <w:t xml:space="preserve"> </w:t>
+      </w:r>
+      <w:r>
+        <w:t xml:space="preserve">choices, timing, and point outcomes.</w:t>
       </w:r>
     </w:p>
     <w:bookmarkStart w:id="22" w:name="setup-and-task-state"/>
@@ -983,7 +1345,31 @@
         </w:numPr>
       </w:pPr>
       <w:r>
+        <w:t xml:space="preserve">Whether per-click point feedback is shown.</w:t>
+      </w:r>
+    </w:p>
+    <w:p>
+      <w:pPr>
+        <w:pStyle w:val="Compact"/>
+        <w:numPr>
+          <w:ilvl w:val="0"/>
+          <w:numId w:val="1007"/>
+        </w:numPr>
+      </w:pPr>
+      <w:r>
         <w:t xml:space="preserve">Common post-click feedback delay.</w:t>
+      </w:r>
+    </w:p>
+    <w:p>
+      <w:pPr>
+        <w:pStyle w:val="Compact"/>
+        <w:numPr>
+          <w:ilvl w:val="0"/>
+          <w:numId w:val="1007"/>
+        </w:numPr>
+      </w:pPr>
+      <w:r>
+        <w:t xml:space="preserve">L-th main-card feedback delay.</w:t>
       </w:r>
     </w:p>
     <w:p>
@@ -1257,7 +1643,19 @@
         <w:t xml:space="preserve"> </w:t>
       </w:r>
       <w:r>
-        <w:t xml:space="preserve">field contains the card id, color, label, display position, main-card status, screen type, and X, Y, Z values where relevant.</w:t>
+        <w:t xml:space="preserve">field contains the card id, color, label, display</w:t>
+      </w:r>
+      <w:r>
+        <w:t xml:space="preserve"> </w:t>
+      </w:r>
+      <w:r>
+        <w:t xml:space="preserve">position, main-card status, screen type, and X, Y, Z values where</w:t>
+      </w:r>
+      <w:r>
+        <w:t xml:space="preserve"> </w:t>
+      </w:r>
+      <w:r>
+        <w:t xml:space="preserve">relevant.</w:t>
       </w:r>
     </w:p>
     <w:bookmarkEnd w:id="24"/>
@@ -1516,7 +1914,13 @@
         <w:pStyle w:val="FirstParagraph"/>
       </w:pPr>
       <w:r>
-        <w:t xml:space="preserve">The setup page is development-only. It exists so the experimenter can quickly adjust parameters while the task is still being built.</w:t>
+        <w:t xml:space="preserve">The setup page is development-only. It exists so the experimenter can</w:t>
+      </w:r>
+      <w:r>
+        <w:t xml:space="preserve"> </w:t>
+      </w:r>
+      <w:r>
+        <w:t xml:space="preserve">quickly adjust parameters while the task is still being built.</w:t>
       </w:r>
     </w:p>
     <w:p>
@@ -1584,7 +1988,7 @@
         </w:numPr>
       </w:pPr>
       <w:r>
-        <w:t xml:space="preserve">Points accumulated.</w:t>
+        <w:t xml:space="preserve">Total Points.</w:t>
       </w:r>
     </w:p>
     <w:p>
@@ -1664,7 +2068,13 @@
         <w:pStyle w:val="FirstParagraph"/>
       </w:pPr>
       <w:r>
-        <w:t xml:space="preserve">These pages should be removed, hidden, or replaced before a production deployment.</w:t>
+        <w:t xml:space="preserve">These pages should be removed, hidden, or replaced before a production</w:t>
+      </w:r>
+      <w:r>
+        <w:t xml:space="preserve"> </w:t>
+      </w:r>
+      <w:r>
+        <w:t xml:space="preserve">deployment.</w:t>
       </w:r>
     </w:p>
     <w:bookmarkEnd w:id="28"/>
@@ -1709,7 +2119,13 @@
         <w:t xml:space="preserve"> </w:t>
       </w:r>
       <w:r>
-        <w:t xml:space="preserve">are placeholder values.</w:t>
+        <w:t xml:space="preserve">are</w:t>
+      </w:r>
+      <w:r>
+        <w:t xml:space="preserve"> </w:t>
+      </w:r>
+      <w:r>
+        <w:t xml:space="preserve">placeholder values.</w:t>
       </w:r>
     </w:p>
     <w:p>
@@ -1721,7 +2137,13 @@
         </w:numPr>
       </w:pPr>
       <w:r>
-        <w:t xml:space="preserve">The connection between Y and Z is not theoretically finalized in the code; they are separate values in the screen-types file.</w:t>
+        <w:t xml:space="preserve">The connection between Y and Z is not theoretically finalized in the</w:t>
+      </w:r>
+      <w:r>
+        <w:t xml:space="preserve"> </w:t>
+      </w:r>
+      <w:r>
+        <w:t xml:space="preserve">code; they are separate values in the screen-types file.</w:t>
       </w:r>
     </w:p>
     <w:p>
@@ -1733,7 +2155,13 @@
         </w:numPr>
       </w:pPr>
       <w:r>
-        <w:t xml:space="preserve">The development setup page is not production-ready and should not be shown to participants.</w:t>
+        <w:t xml:space="preserve">The development setup page is not production-ready and should not be</w:t>
+      </w:r>
+      <w:r>
+        <w:t xml:space="preserve"> </w:t>
+      </w:r>
+      <w:r>
+        <w:t xml:space="preserve">shown to participants.</w:t>
       </w:r>
     </w:p>
     <w:p>
@@ -1745,7 +2173,13 @@
         </w:numPr>
       </w:pPr>
       <w:r>
-        <w:t xml:space="preserve">The debug results page is not production-ready and should not be shown to participants.</w:t>
+        <w:t xml:space="preserve">The debug results page is not production-ready and should not be shown</w:t>
+      </w:r>
+      <w:r>
+        <w:t xml:space="preserve"> </w:t>
+      </w:r>
+      <w:r>
+        <w:t xml:space="preserve">to participants.</w:t>
       </w:r>
     </w:p>
     <w:p>
@@ -1769,7 +2203,19 @@
         </w:numPr>
       </w:pPr>
       <w:r>
-        <w:t xml:space="preserve">The current number of available screen types is 50 by default, but this is still a code/session-configuration parameter rather than a participant-facing setting.</w:t>
+        <w:t xml:space="preserve">The current number of available screen types is 50 by default, but</w:t>
+      </w:r>
+      <w:r>
+        <w:t xml:space="preserve"> </w:t>
+      </w:r>
+      <w:r>
+        <w:t xml:space="preserve">this is still a code/session-configuration parameter rather than a</w:t>
+      </w:r>
+      <w:r>
+        <w:t xml:space="preserve"> </w:t>
+      </w:r>
+      <w:r>
+        <w:t xml:space="preserve">participant-facing setting.</w:t>
       </w:r>
     </w:p>
     <w:bookmarkEnd w:id="29"/>
@@ -1797,7 +2243,19 @@
         <w:t xml:space="preserve">card_stacking/__init__.py</w:t>
       </w:r>
       <w:r>
-        <w:t xml:space="preserve">: core oTree models, setup fields, randomization, sequence generation, page logic, saved fields, and results/debug summaries.</w:t>
+        <w:t xml:space="preserve">: core oTree models, setup fields,</w:t>
+      </w:r>
+      <w:r>
+        <w:t xml:space="preserve"> </w:t>
+      </w:r>
+      <w:r>
+        <w:t xml:space="preserve">randomization, sequence generation, page logic, saved fields, and</w:t>
+      </w:r>
+      <w:r>
+        <w:t xml:space="preserve"> </w:t>
+      </w:r>
+      <w:r>
+        <w:t xml:space="preserve">results/debug summaries.</w:t>
       </w:r>
     </w:p>
     <w:p>
@@ -1815,7 +2273,13 @@
         <w:t xml:space="preserve">card_stacking/DevelopmentSetup.html</w:t>
       </w:r>
       <w:r>
-        <w:t xml:space="preserve">: development-only experimenter setup page and dynamic defaults for L and Q.</w:t>
+        <w:t xml:space="preserve">: development-only experimenter</w:t>
+      </w:r>
+      <w:r>
+        <w:t xml:space="preserve"> </w:t>
+      </w:r>
+      <w:r>
+        <w:t xml:space="preserve">setup page and dynamic defaults for L and Q.</w:t>
       </w:r>
     </w:p>
     <w:p>
@@ -1833,7 +2297,13 @@
         <w:t xml:space="preserve">card_stacking/Decision.html</w:t>
       </w:r>
       <w:r>
-        <w:t xml:space="preserve">: decision-screen layout and hidden form fields.</w:t>
+        <w:t xml:space="preserve">: decision-screen layout and hidden form</w:t>
+      </w:r>
+      <w:r>
+        <w:t xml:space="preserve"> </w:t>
+      </w:r>
+      <w:r>
+        <w:t xml:space="preserve">fields.</w:t>
       </w:r>
     </w:p>
     <w:p>
@@ -1851,7 +2321,19 @@
         <w:t xml:space="preserve">_static/global/card_stacking.js</w:t>
       </w:r>
       <w:r>
-        <w:t xml:space="preserve">: time-left counter, inactivity timer, click handling, multiplier draw, points updates, and feedback cue behavior.</w:t>
+        <w:t xml:space="preserve">: time-left counter, inactivity</w:t>
+      </w:r>
+      <w:r>
+        <w:t xml:space="preserve"> </w:t>
+      </w:r>
+      <w:r>
+        <w:t xml:space="preserve">timer, click handling, multiplier draw, points updates, and feedback</w:t>
+      </w:r>
+      <w:r>
+        <w:t xml:space="preserve"> </w:t>
+      </w:r>
+      <w:r>
+        <w:t xml:space="preserve">cue behavior.</w:t>
       </w:r>
     </w:p>
     <w:p>
@@ -1869,7 +2351,13 @@
         <w:t xml:space="preserve">card_stacking/screen_types.txt</w:t>
       </w:r>
       <w:r>
-        <w:t xml:space="preserve">: placeholder decision screen type definitions.</w:t>
+        <w:t xml:space="preserve">: placeholder decision screen type</w:t>
+      </w:r>
+      <w:r>
+        <w:t xml:space="preserve"> </w:t>
+      </w:r>
+      <w:r>
+        <w:t xml:space="preserve">definitions.</w:t>
       </w:r>
     </w:p>
     <w:p>
@@ -1887,7 +2375,13 @@
         <w:t xml:space="preserve">settings.py</w:t>
       </w:r>
       <w:r>
-        <w:t xml:space="preserve">: participant fields used to store participant-level task state.</w:t>
+        <w:t xml:space="preserve">: participant fields used to store participant-level task</w:t>
+      </w:r>
+      <w:r>
+        <w:t xml:space="preserve"> </w:t>
+      </w:r>
+      <w:r>
+        <w:t xml:space="preserve">state.</w:t>
       </w:r>
     </w:p>
     <w:bookmarkEnd w:id="30"/>

</xml_diff>